<commit_message>
Add student name and registration number to report title page
Co-Authored-By: Claude Sonnet 5.5 <noreply@anthropic.com>
Claude-Session: https://claude.ai/code/session_01QSgEzfGPEyfsc4ux2grPAE
</commit_message>
<xml_diff>
--- a/project/report/Prompt_Engineering_IS4143_Research_Report.docx
+++ b/project/report/Prompt_Engineering_IS4143_Research_Report.docx
@@ -179,7 +179,7 @@
           <w:i w:val="0"/>
           <w:sz w:val="24"/>
         </w:rPr>
-        <w:t>[Name of Student]</w:t>
+        <w:t>AYUSH ANAND</w:t>
       </w:r>
     </w:p>
     <w:p>
@@ -194,7 +194,7 @@
           <w:i w:val="0"/>
           <w:sz w:val="24"/>
         </w:rPr>
-        <w:t>[Registration Number]</w:t>
+        <w:t>23FE10CII00144</w:t>
       </w:r>
     </w:p>
     <w:p>

</xml_diff>